<commit_message>
todo-list tailwind css update
</commit_message>
<xml_diff>
--- a/task/java/week13/java2_week13_기본API스레드_과제.docx
+++ b/task/java/week13/java2_week13_기본API스레드_과제.docx
@@ -28421,7 +28421,6 @@
         </w:rPr>
         <w:t xml:space="preserve">() </w:t>
       </w:r>
-      <w:proofErr w:type="spellStart"/>
       <w:r>
         <w:rPr>
           <w:rFonts w:asciiTheme="minorEastAsia" w:hAnsiTheme="minorEastAsia" w:hint="eastAsia"/>
@@ -28431,16 +28430,6 @@
         </w:rPr>
         <w:t>사용</w:t>
       </w:r>
-      <w:r>
-        <w:rPr>
-          <w:rFonts w:asciiTheme="minorEastAsia" w:hAnsiTheme="minorEastAsia" w:hint="eastAsia"/>
-          <w:b/>
-          <w:color w:val="FF0000"/>
-          <w:szCs w:val="20"/>
-        </w:rPr>
-        <w:t>ㅌ</w:t>
-      </w:r>
-      <w:proofErr w:type="spellEnd"/>
     </w:p>
     <w:p>
       <w:pPr>

</xml_diff>